<commit_message>
Reformat Customer Stories authoring details as Displayed data table
Adopt the standard 'Displayed data | Content is sourced from | Required' table
for authoring details going forward, applied to the Customer Stories story.

Co-Authored-By: Claude Opus 4.6 (1M context) <noreply@anthropic.com>
</commit_message>
<xml_diff>
--- a/docs/SDD/Stories/Home-Page/EC-Customer-Stories-Story.docx
+++ b/docs/SDD/Stories/Home-Page/EC-Customer-Stories-Story.docx
@@ -421,9 +421,6 @@
       </w:r>
     </w:p>
     <w:p>
-      <w:pPr>
-        <w:pStyle w:val="ListBullet"/>
-      </w:pPr>
       <w:r>
         <w:t xml:space="preserve">Authored as a block table (e.g., </w:t>
       </w:r>
@@ -434,75 +431,495 @@
         <w:t>`Customer Stories`</w:t>
       </w:r>
       <w:r>
-        <w:t>) in the home page document.</w:t>
+        <w:t>) in the home page document. The mixed-size image collage is a layout treatment of the block — the author supplies images; the block arranges them per the design.</w:t>
       </w:r>
     </w:p>
-    <w:p>
-      <w:pPr>
-        <w:pStyle w:val="ListBullet"/>
-      </w:pPr>
-      <w:r>
-        <w:t>Author-configurable:</w:t>
-      </w:r>
-    </w:p>
-    <w:p>
-      <w:pPr>
-        <w:pStyle w:val="ListBullet"/>
-      </w:pPr>
-      <w:r>
-        <w:rPr>
-          <w:b/>
-        </w:rPr>
-        <w:t>Heading</w:t>
-      </w:r>
-      <w:r>
-        <w:t xml:space="preserve"> text.</w:t>
-      </w:r>
-    </w:p>
-    <w:p>
-      <w:pPr>
-        <w:pStyle w:val="ListBullet"/>
-      </w:pPr>
-      <w:r>
-        <w:rPr>
-          <w:b/>
-        </w:rPr>
-        <w:t>Stories/slides</w:t>
-      </w:r>
-      <w:r>
-        <w:t>: each = image(s) + headline + supporting text (+ optional per-slide link).</w:t>
-      </w:r>
-    </w:p>
-    <w:p>
-      <w:pPr>
-        <w:pStyle w:val="ListBullet"/>
-      </w:pPr>
-      <w:r>
-        <w:rPr>
-          <w:b/>
-        </w:rPr>
-        <w:t>CTA</w:t>
-      </w:r>
-      <w:r>
-        <w:t>: label ("Know More") + link.</w:t>
-      </w:r>
-    </w:p>
-    <w:p>
-      <w:pPr>
-        <w:pStyle w:val="ListBullet"/>
-      </w:pPr>
-      <w:r>
-        <w:t>Order of slides (reorder by reordering rows); autoplay/loop toggle.</w:t>
-      </w:r>
-    </w:p>
-    <w:p>
-      <w:pPr>
-        <w:pStyle w:val="ListBullet"/>
-      </w:pPr>
-      <w:r>
-        <w:t>The mixed-size image collage is a layout treatment of the block — author supplies images; the block arranges them per the design.</w:t>
-      </w:r>
-    </w:p>
+    <w:tbl>
+      <w:tblPr>
+        <w:tblStyle w:val="TableGrid"/>
+        <w:tblW w:type="auto" w:w="0"/>
+        <w:jc w:val="left"/>
+        <w:tblLook w:firstColumn="1" w:firstRow="1" w:lastColumn="0" w:lastRow="0" w:noHBand="0" w:noVBand="1" w:val="04A0"/>
+      </w:tblPr>
+      <w:tblGrid>
+        <w:gridCol w:w="2880"/>
+        <w:gridCol w:w="2880"/>
+        <w:gridCol w:w="2880"/>
+      </w:tblGrid>
+      <w:tr>
+        <w:tc>
+          <w:tcPr>
+            <w:tcW w:type="dxa" w:w="2880"/>
+            <w:shd w:fill="2C3E50" w:val="clear"/>
+          </w:tcPr>
+          <w:p>
+            <w:r>
+              <w:rPr>
+                <w:b/>
+                <w:color w:val="FFFFFF"/>
+                <w:sz w:val="18"/>
+              </w:rPr>
+            </w:r>
+            <w:r>
+              <w:rPr>
+                <w:b/>
+                <w:color w:val="FFFFFF"/>
+                <w:sz w:val="18"/>
+              </w:rPr>
+              <w:t>Displayed data</w:t>
+            </w:r>
+          </w:p>
+        </w:tc>
+        <w:tc>
+          <w:tcPr>
+            <w:tcW w:type="dxa" w:w="2880"/>
+            <w:shd w:fill="2C3E50" w:val="clear"/>
+          </w:tcPr>
+          <w:p>
+            <w:r>
+              <w:rPr>
+                <w:b/>
+                <w:color w:val="FFFFFF"/>
+                <w:sz w:val="18"/>
+              </w:rPr>
+            </w:r>
+            <w:r>
+              <w:rPr>
+                <w:b/>
+                <w:color w:val="FFFFFF"/>
+                <w:sz w:val="18"/>
+              </w:rPr>
+              <w:t>Content is sourced from</w:t>
+            </w:r>
+          </w:p>
+        </w:tc>
+        <w:tc>
+          <w:tcPr>
+            <w:tcW w:type="dxa" w:w="2880"/>
+            <w:shd w:fill="2C3E50" w:val="clear"/>
+          </w:tcPr>
+          <w:p>
+            <w:r>
+              <w:rPr>
+                <w:b/>
+                <w:color w:val="FFFFFF"/>
+                <w:sz w:val="18"/>
+              </w:rPr>
+            </w:r>
+            <w:r>
+              <w:rPr>
+                <w:b/>
+                <w:color w:val="FFFFFF"/>
+                <w:sz w:val="18"/>
+              </w:rPr>
+              <w:t>Required</w:t>
+            </w:r>
+          </w:p>
+        </w:tc>
+      </w:tr>
+      <w:tr>
+        <w:tc>
+          <w:tcPr>
+            <w:tcW w:type="dxa" w:w="2880"/>
+          </w:tcPr>
+          <w:p>
+            <w:r>
+              <w:rPr>
+                <w:sz w:val="18"/>
+              </w:rPr>
+            </w:r>
+            <w:r>
+              <w:rPr>
+                <w:sz w:val="18"/>
+              </w:rPr>
+              <w:t>Section heading (Customer Stories)</w:t>
+            </w:r>
+          </w:p>
+        </w:tc>
+        <w:tc>
+          <w:tcPr>
+            <w:tcW w:type="dxa" w:w="2880"/>
+          </w:tcPr>
+          <w:p>
+            <w:r>
+              <w:rPr>
+                <w:sz w:val="18"/>
+              </w:rPr>
+            </w:r>
+            <w:r>
+              <w:rPr>
+                <w:sz w:val="18"/>
+              </w:rPr>
+              <w:t>EDS</w:t>
+            </w:r>
+          </w:p>
+        </w:tc>
+        <w:tc>
+          <w:tcPr>
+            <w:tcW w:type="dxa" w:w="2880"/>
+          </w:tcPr>
+          <w:p>
+            <w:r>
+              <w:rPr>
+                <w:sz w:val="18"/>
+              </w:rPr>
+            </w:r>
+            <w:r>
+              <w:rPr>
+                <w:sz w:val="18"/>
+              </w:rPr>
+              <w:t>Y</w:t>
+            </w:r>
+          </w:p>
+        </w:tc>
+      </w:tr>
+      <w:tr>
+        <w:tc>
+          <w:tcPr>
+            <w:tcW w:type="dxa" w:w="2880"/>
+            <w:shd w:fill="F4F6F7" w:val="clear"/>
+          </w:tcPr>
+          <w:p>
+            <w:r>
+              <w:rPr>
+                <w:sz w:val="18"/>
+              </w:rPr>
+            </w:r>
+            <w:r>
+              <w:rPr>
+                <w:sz w:val="18"/>
+              </w:rPr>
+              <w:t>Story image</w:t>
+            </w:r>
+          </w:p>
+        </w:tc>
+        <w:tc>
+          <w:tcPr>
+            <w:tcW w:type="dxa" w:w="2880"/>
+            <w:shd w:fill="F4F6F7" w:val="clear"/>
+          </w:tcPr>
+          <w:p>
+            <w:r>
+              <w:rPr>
+                <w:sz w:val="18"/>
+              </w:rPr>
+            </w:r>
+            <w:r>
+              <w:rPr>
+                <w:sz w:val="18"/>
+              </w:rPr>
+              <w:t>EDS</w:t>
+            </w:r>
+          </w:p>
+        </w:tc>
+        <w:tc>
+          <w:tcPr>
+            <w:tcW w:type="dxa" w:w="2880"/>
+            <w:shd w:fill="F4F6F7" w:val="clear"/>
+          </w:tcPr>
+          <w:p>
+            <w:r>
+              <w:rPr>
+                <w:sz w:val="18"/>
+              </w:rPr>
+            </w:r>
+            <w:r>
+              <w:rPr>
+                <w:sz w:val="18"/>
+              </w:rPr>
+              <w:t>N</w:t>
+            </w:r>
+          </w:p>
+        </w:tc>
+      </w:tr>
+      <w:tr>
+        <w:tc>
+          <w:tcPr>
+            <w:tcW w:type="dxa" w:w="2880"/>
+          </w:tcPr>
+          <w:p>
+            <w:r>
+              <w:rPr>
+                <w:sz w:val="18"/>
+              </w:rPr>
+            </w:r>
+            <w:r>
+              <w:rPr>
+                <w:sz w:val="18"/>
+              </w:rPr>
+              <w:t>Story title / headline</w:t>
+            </w:r>
+          </w:p>
+        </w:tc>
+        <w:tc>
+          <w:tcPr>
+            <w:tcW w:type="dxa" w:w="2880"/>
+          </w:tcPr>
+          <w:p>
+            <w:r>
+              <w:rPr>
+                <w:sz w:val="18"/>
+              </w:rPr>
+            </w:r>
+            <w:r>
+              <w:rPr>
+                <w:sz w:val="18"/>
+              </w:rPr>
+              <w:t>EDS</w:t>
+            </w:r>
+          </w:p>
+        </w:tc>
+        <w:tc>
+          <w:tcPr>
+            <w:tcW w:type="dxa" w:w="2880"/>
+          </w:tcPr>
+          <w:p>
+            <w:r>
+              <w:rPr>
+                <w:sz w:val="18"/>
+              </w:rPr>
+            </w:r>
+            <w:r>
+              <w:rPr>
+                <w:sz w:val="18"/>
+              </w:rPr>
+              <w:t>N</w:t>
+            </w:r>
+          </w:p>
+        </w:tc>
+      </w:tr>
+      <w:tr>
+        <w:tc>
+          <w:tcPr>
+            <w:tcW w:type="dxa" w:w="2880"/>
+            <w:shd w:fill="F4F6F7" w:val="clear"/>
+          </w:tcPr>
+          <w:p>
+            <w:r>
+              <w:rPr>
+                <w:sz w:val="18"/>
+              </w:rPr>
+            </w:r>
+            <w:r>
+              <w:rPr>
+                <w:sz w:val="18"/>
+              </w:rPr>
+              <w:t>Story description / body copy</w:t>
+            </w:r>
+          </w:p>
+        </w:tc>
+        <w:tc>
+          <w:tcPr>
+            <w:tcW w:type="dxa" w:w="2880"/>
+            <w:shd w:fill="F4F6F7" w:val="clear"/>
+          </w:tcPr>
+          <w:p>
+            <w:r>
+              <w:rPr>
+                <w:sz w:val="18"/>
+              </w:rPr>
+            </w:r>
+            <w:r>
+              <w:rPr>
+                <w:sz w:val="18"/>
+              </w:rPr>
+              <w:t>EDS</w:t>
+            </w:r>
+          </w:p>
+        </w:tc>
+        <w:tc>
+          <w:tcPr>
+            <w:tcW w:type="dxa" w:w="2880"/>
+            <w:shd w:fill="F4F6F7" w:val="clear"/>
+          </w:tcPr>
+          <w:p>
+            <w:r>
+              <w:rPr>
+                <w:sz w:val="18"/>
+              </w:rPr>
+            </w:r>
+            <w:r>
+              <w:rPr>
+                <w:sz w:val="18"/>
+              </w:rPr>
+              <w:t>N</w:t>
+            </w:r>
+          </w:p>
+        </w:tc>
+      </w:tr>
+      <w:tr>
+        <w:tc>
+          <w:tcPr>
+            <w:tcW w:type="dxa" w:w="2880"/>
+          </w:tcPr>
+          <w:p>
+            <w:r>
+              <w:rPr>
+                <w:sz w:val="18"/>
+              </w:rPr>
+            </w:r>
+            <w:r>
+              <w:rPr>
+                <w:sz w:val="18"/>
+              </w:rPr>
+              <w:t>Primary CTA label</w:t>
+            </w:r>
+          </w:p>
+        </w:tc>
+        <w:tc>
+          <w:tcPr>
+            <w:tcW w:type="dxa" w:w="2880"/>
+          </w:tcPr>
+          <w:p>
+            <w:r>
+              <w:rPr>
+                <w:sz w:val="18"/>
+              </w:rPr>
+            </w:r>
+            <w:r>
+              <w:rPr>
+                <w:sz w:val="18"/>
+              </w:rPr>
+              <w:t>EDS</w:t>
+            </w:r>
+          </w:p>
+        </w:tc>
+        <w:tc>
+          <w:tcPr>
+            <w:tcW w:type="dxa" w:w="2880"/>
+          </w:tcPr>
+          <w:p>
+            <w:r>
+              <w:rPr>
+                <w:sz w:val="18"/>
+              </w:rPr>
+            </w:r>
+            <w:r>
+              <w:rPr>
+                <w:sz w:val="18"/>
+              </w:rPr>
+              <w:t>N</w:t>
+            </w:r>
+          </w:p>
+        </w:tc>
+      </w:tr>
+      <w:tr>
+        <w:tc>
+          <w:tcPr>
+            <w:tcW w:type="dxa" w:w="2880"/>
+            <w:shd w:fill="F4F6F7" w:val="clear"/>
+          </w:tcPr>
+          <w:p>
+            <w:r>
+              <w:rPr>
+                <w:sz w:val="18"/>
+              </w:rPr>
+            </w:r>
+            <w:r>
+              <w:rPr>
+                <w:sz w:val="18"/>
+              </w:rPr>
+              <w:t>Primary CTA link</w:t>
+            </w:r>
+          </w:p>
+        </w:tc>
+        <w:tc>
+          <w:tcPr>
+            <w:tcW w:type="dxa" w:w="2880"/>
+            <w:shd w:fill="F4F6F7" w:val="clear"/>
+          </w:tcPr>
+          <w:p>
+            <w:r>
+              <w:rPr>
+                <w:sz w:val="18"/>
+              </w:rPr>
+            </w:r>
+            <w:r>
+              <w:rPr>
+                <w:sz w:val="18"/>
+              </w:rPr>
+              <w:t>EDS</w:t>
+            </w:r>
+          </w:p>
+        </w:tc>
+        <w:tc>
+          <w:tcPr>
+            <w:tcW w:type="dxa" w:w="2880"/>
+            <w:shd w:fill="F4F6F7" w:val="clear"/>
+          </w:tcPr>
+          <w:p>
+            <w:r>
+              <w:rPr>
+                <w:sz w:val="18"/>
+              </w:rPr>
+            </w:r>
+            <w:r>
+              <w:rPr>
+                <w:sz w:val="18"/>
+              </w:rPr>
+              <w:t>N</w:t>
+            </w:r>
+          </w:p>
+        </w:tc>
+      </w:tr>
+      <w:tr>
+        <w:tc>
+          <w:tcPr>
+            <w:tcW w:type="dxa" w:w="2880"/>
+          </w:tcPr>
+          <w:p>
+            <w:r>
+              <w:rPr>
+                <w:sz w:val="18"/>
+              </w:rPr>
+            </w:r>
+            <w:r>
+              <w:rPr>
+                <w:sz w:val="18"/>
+              </w:rPr>
+              <w:t>Carousel / slide navigation controls</w:t>
+            </w:r>
+          </w:p>
+        </w:tc>
+        <w:tc>
+          <w:tcPr>
+            <w:tcW w:type="dxa" w:w="2880"/>
+          </w:tcPr>
+          <w:p>
+            <w:r>
+              <w:rPr>
+                <w:sz w:val="18"/>
+              </w:rPr>
+            </w:r>
+            <w:r>
+              <w:rPr>
+                <w:sz w:val="18"/>
+              </w:rPr>
+              <w:t>EDS</w:t>
+            </w:r>
+          </w:p>
+        </w:tc>
+        <w:tc>
+          <w:tcPr>
+            <w:tcW w:type="dxa" w:w="2880"/>
+          </w:tcPr>
+          <w:p>
+            <w:r>
+              <w:rPr>
+                <w:sz w:val="18"/>
+              </w:rPr>
+            </w:r>
+            <w:r>
+              <w:rPr>
+                <w:sz w:val="18"/>
+              </w:rPr>
+              <w:t>N</w:t>
+            </w:r>
+          </w:p>
+        </w:tc>
+      </w:tr>
+    </w:tbl>
+    <w:p/>
     <w:p>
       <w:pPr>
         <w:pStyle w:val="Heading2"/>

</xml_diff>